<commit_message>
Include theme and save-success UI required by main window.
Co-authored-by: Cursor <cursoragent@cursor.com>
</commit_message>
<xml_diff>
--- a/templates/template_ze.docx
+++ b/templates/template_ze.docx
@@ -225,9 +225,13 @@
         <w:t>Please refer to the following pages</w:t>
       </w:r>
     </w:p>
-    <w:p/>
-    <w:p/>
-    <w:p/>
+    <w:p>
+      <w:pPr>
+        <w:rPr>
+          <w:rFonts w:hint="eastAsia"/>
+        </w:rPr>
+      </w:pPr>
+    </w:p>
     <w:tbl>
       <w:tblPr>
         <w:tblW w:w="8802" w:type="dxa"/>
@@ -236,14 +240,290 @@
       </w:tblPr>
       <w:tblGrid>
         <w:gridCol w:w="87"/>
-        <w:gridCol w:w="1299"/>
+        <w:gridCol w:w="1287"/>
+        <w:gridCol w:w="12"/>
         <w:gridCol w:w="2124"/>
-        <w:gridCol w:w="440"/>
-        <w:gridCol w:w="949"/>
+        <w:gridCol w:w="405"/>
+        <w:gridCol w:w="35"/>
+        <w:gridCol w:w="906"/>
+        <w:gridCol w:w="43"/>
         <w:gridCol w:w="1315"/>
-        <w:gridCol w:w="2510"/>
+        <w:gridCol w:w="172"/>
+        <w:gridCol w:w="2261"/>
+        <w:gridCol w:w="77"/>
         <w:gridCol w:w="78"/>
       </w:tblGrid>
+      <w:tr>
+        <w:trPr>
+          <w:gridAfter w:val="2"/>
+          <w:wAfter w:w="155" w:type="dxa"/>
+          <w:trHeight w:val="668"/>
+        </w:trPr>
+        <w:tc>
+          <w:tcPr>
+            <w:tcW w:w="1374" w:type="dxa"/>
+            <w:gridSpan w:val="2"/>
+            <w:vAlign w:val="center"/>
+          </w:tcPr>
+          <w:p>
+            <w:pPr>
+              <w:jc w:val="center"/>
+              <w:rPr>
+                <w:bCs/>
+              </w:rPr>
+            </w:pPr>
+            <w:r>
+              <w:rPr>
+                <w:bCs/>
+              </w:rPr>
+              <w:t>编</w:t>
+            </w:r>
+            <w:r>
+              <w:rPr>
+                <w:bCs/>
+              </w:rPr>
+              <w:t xml:space="preserve">    </w:t>
+            </w:r>
+            <w:r>
+              <w:rPr>
+                <w:bCs/>
+              </w:rPr>
+              <w:t>制</w:t>
+            </w:r>
+          </w:p>
+          <w:p>
+            <w:pPr>
+              <w:jc w:val="center"/>
+              <w:rPr>
+                <w:bCs/>
+              </w:rPr>
+            </w:pPr>
+            <w:r>
+              <w:rPr>
+                <w:bCs/>
+              </w:rPr>
+              <w:t>Written by</w:t>
+            </w:r>
+          </w:p>
+        </w:tc>
+        <w:tc>
+          <w:tcPr>
+            <w:tcW w:w="2541" w:type="dxa"/>
+            <w:gridSpan w:val="3"/>
+            <w:tcBorders>
+              <w:bottom w:val="single" w:sz="4" w:space="0" w:color="auto"/>
+            </w:tcBorders>
+            <w:vAlign w:val="center"/>
+          </w:tcPr>
+          <w:p>
+            <w:pPr>
+              <w:jc w:val="center"/>
+            </w:pPr>
+            <w:r>
+              <w:rPr>
+                <w:noProof/>
+              </w:rPr>
+              <w:drawing>
+                <wp:inline distT="0" distB="0" distL="0" distR="0" wp14:anchorId="28CE7DA1" wp14:editId="14B64D9A">
+                  <wp:extent cx="1038225" cy="523875"/>
+                  <wp:effectExtent l="0" t="0" r="0" b="0"/>
+                  <wp:docPr id="1407253703" name="图片 5"/>
+                  <wp:cNvGraphicFramePr>
+                    <a:graphicFrameLocks xmlns:a="http://schemas.openxmlformats.org/drawingml/2006/main" noChangeAspect="1"/>
+                  </wp:cNvGraphicFramePr>
+                  <a:graphic xmlns:a="http://schemas.openxmlformats.org/drawingml/2006/main">
+                    <a:graphicData uri="http://schemas.openxmlformats.org/drawingml/2006/picture">
+                      <pic:pic xmlns:pic="http://schemas.openxmlformats.org/drawingml/2006/picture">
+                        <pic:nvPicPr>
+                          <pic:cNvPr id="1" name="图片 5"/>
+                          <pic:cNvPicPr>
+                            <a:picLocks noChangeAspect="1" noChangeArrowheads="1"/>
+                          </pic:cNvPicPr>
+                        </pic:nvPicPr>
+                        <pic:blipFill>
+                          <a:blip r:embed="rId9">
+                            <a:clrChange>
+                              <a:clrFrom>
+                                <a:srgbClr val="FFFFFF"/>
+                              </a:clrFrom>
+                              <a:clrTo>
+                                <a:srgbClr val="FFFFFF">
+                                  <a:alpha val="0"/>
+                                </a:srgbClr>
+                              </a:clrTo>
+                            </a:clrChange>
+                            <a:extLst>
+                              <a:ext uri="{28A0092B-C50C-407E-A947-70E740481C1C}">
+                                <a14:useLocalDpi xmlns:a14="http://schemas.microsoft.com/office/drawing/2010/main" val="0"/>
+                              </a:ext>
+                            </a:extLst>
+                          </a:blip>
+                          <a:srcRect/>
+                          <a:stretch>
+                            <a:fillRect/>
+                          </a:stretch>
+                        </pic:blipFill>
+                        <pic:spPr>
+                          <a:xfrm>
+                            <a:off x="0" y="0"/>
+                            <a:ext cx="1038225" cy="523875"/>
+                          </a:xfrm>
+                          <a:prstGeom prst="rect">
+                            <a:avLst/>
+                          </a:prstGeom>
+                          <a:noFill/>
+                          <a:ln>
+                            <a:noFill/>
+                          </a:ln>
+                        </pic:spPr>
+                      </pic:pic>
+                    </a:graphicData>
+                  </a:graphic>
+                </wp:inline>
+              </w:drawing>
+            </w:r>
+          </w:p>
+        </w:tc>
+        <w:tc>
+          <w:tcPr>
+            <w:tcW w:w="941" w:type="dxa"/>
+            <w:gridSpan w:val="2"/>
+            <w:vAlign w:val="center"/>
+          </w:tcPr>
+          <w:p>
+            <w:pPr>
+              <w:jc w:val="center"/>
+              <w:rPr>
+                <w:bCs/>
+              </w:rPr>
+            </w:pPr>
+          </w:p>
+        </w:tc>
+        <w:tc>
+          <w:tcPr>
+            <w:tcW w:w="1530" w:type="dxa"/>
+            <w:gridSpan w:val="3"/>
+            <w:vAlign w:val="center"/>
+          </w:tcPr>
+          <w:p>
+            <w:pPr>
+              <w:jc w:val="center"/>
+              <w:rPr>
+                <w:bCs/>
+              </w:rPr>
+            </w:pPr>
+            <w:r>
+              <w:rPr>
+                <w:bCs/>
+              </w:rPr>
+              <w:t>审</w:t>
+            </w:r>
+            <w:r>
+              <w:rPr>
+                <w:bCs/>
+              </w:rPr>
+              <w:t xml:space="preserve">    </w:t>
+            </w:r>
+            <w:r>
+              <w:rPr>
+                <w:bCs/>
+              </w:rPr>
+              <w:t>核</w:t>
+            </w:r>
+          </w:p>
+          <w:p>
+            <w:pPr>
+              <w:jc w:val="center"/>
+              <w:rPr>
+                <w:bCs/>
+              </w:rPr>
+            </w:pPr>
+            <w:r>
+              <w:rPr>
+                <w:bCs/>
+              </w:rPr>
+              <w:t>Inspected by</w:t>
+            </w:r>
+          </w:p>
+        </w:tc>
+        <w:tc>
+          <w:tcPr>
+            <w:tcW w:w="2261" w:type="dxa"/>
+            <w:tcBorders>
+              <w:bottom w:val="single" w:sz="4" w:space="0" w:color="auto"/>
+            </w:tcBorders>
+            <w:vAlign w:val="center"/>
+          </w:tcPr>
+          <w:p>
+            <w:pPr>
+              <w:jc w:val="center"/>
+            </w:pPr>
+            <w:r>
+              <w:rPr>
+                <w:noProof/>
+              </w:rPr>
+              <w:drawing>
+                <wp:inline distT="0" distB="0" distL="0" distR="0" wp14:anchorId="30CBC4B1" wp14:editId="1445998A">
+                  <wp:extent cx="1295400" cy="381000"/>
+                  <wp:effectExtent l="0" t="0" r="0" b="0"/>
+                  <wp:docPr id="3490381" name="图片 4" descr="李赫英文签"/>
+                  <wp:cNvGraphicFramePr>
+                    <a:graphicFrameLocks xmlns:a="http://schemas.openxmlformats.org/drawingml/2006/main" noChangeAspect="1"/>
+                  </wp:cNvGraphicFramePr>
+                  <a:graphic xmlns:a="http://schemas.openxmlformats.org/drawingml/2006/main">
+                    <a:graphicData uri="http://schemas.openxmlformats.org/drawingml/2006/picture">
+                      <pic:pic xmlns:pic="http://schemas.openxmlformats.org/drawingml/2006/picture">
+                        <pic:nvPicPr>
+                          <pic:cNvPr id="2" name="图片 4" descr="李赫英文签"/>
+                          <pic:cNvPicPr>
+                            <a:picLocks noChangeAspect="1" noChangeArrowheads="1"/>
+                          </pic:cNvPicPr>
+                        </pic:nvPicPr>
+                        <pic:blipFill>
+                          <a:blip r:embed="rId10" cstate="print">
+                            <a:clrChange>
+                              <a:clrFrom>
+                                <a:srgbClr val="FFFFFF"/>
+                              </a:clrFrom>
+                              <a:clrTo>
+                                <a:srgbClr val="FFFFFF">
+                                  <a:alpha val="0"/>
+                                </a:srgbClr>
+                              </a:clrTo>
+                            </a:clrChange>
+                            <a:extLst>
+                              <a:ext uri="{28A0092B-C50C-407E-A947-70E740481C1C}">
+                                <a14:useLocalDpi xmlns:a14="http://schemas.microsoft.com/office/drawing/2010/main" val="0"/>
+                              </a:ext>
+                            </a:extLst>
+                          </a:blip>
+                          <a:srcRect/>
+                          <a:stretch>
+                            <a:fillRect/>
+                          </a:stretch>
+                        </pic:blipFill>
+                        <pic:spPr>
+                          <a:xfrm>
+                            <a:off x="0" y="0"/>
+                            <a:ext cx="1295400" cy="381000"/>
+                          </a:xfrm>
+                          <a:prstGeom prst="rect">
+                            <a:avLst/>
+                          </a:prstGeom>
+                          <a:noFill/>
+                          <a:ln>
+                            <a:noFill/>
+                          </a:ln>
+                        </pic:spPr>
+                      </pic:pic>
+                    </a:graphicData>
+                  </a:graphic>
+                </wp:inline>
+              </w:drawing>
+            </w:r>
+          </w:p>
+        </w:tc>
+      </w:tr>
       <w:tr>
         <w:trPr>
           <w:gridBefore w:val="1"/>
@@ -253,7 +533,7 @@
         <w:tc>
           <w:tcPr>
             <w:tcW w:w="3423" w:type="dxa"/>
-            <w:gridSpan w:val="2"/>
+            <w:gridSpan w:val="3"/>
             <w:vAlign w:val="center"/>
           </w:tcPr>
           <w:p>
@@ -270,7 +550,7 @@
         <w:tc>
           <w:tcPr>
             <w:tcW w:w="5292" w:type="dxa"/>
-            <w:gridSpan w:val="5"/>
+            <w:gridSpan w:val="9"/>
             <w:vAlign w:val="center"/>
           </w:tcPr>
           <w:p/>
@@ -285,7 +565,7 @@
         <w:tc>
           <w:tcPr>
             <w:tcW w:w="1386" w:type="dxa"/>
-            <w:gridSpan w:val="2"/>
+            <w:gridSpan w:val="3"/>
             <w:vAlign w:val="center"/>
           </w:tcPr>
           <w:p>
@@ -297,21 +577,24 @@
             </w:pPr>
             <w:r>
               <w:rPr>
-                <w:bCs/>
-              </w:rPr>
-              <w:t>签</w:t>
-            </w:r>
-            <w:r>
-              <w:rPr>
-                <w:bCs/>
-              </w:rPr>
-              <w:t xml:space="preserve">    </w:t>
-            </w:r>
-            <w:r>
-              <w:rPr>
-                <w:bCs/>
-              </w:rPr>
-              <w:t>发</w:t>
+                <w:rFonts w:hint="eastAsia"/>
+                <w:bCs/>
+              </w:rPr>
+              <w:t>批。</w:t>
+            </w:r>
+            <w:r>
+              <w:rPr>
+                <w:rFonts w:hint="eastAsia"/>
+                <w:bCs/>
+              </w:rPr>
+              <w:t xml:space="preserve">  </w:t>
+            </w:r>
+            <w:r>
+              <w:rPr>
+                <w:rFonts w:hint="eastAsia"/>
+                <w:bCs/>
+              </w:rPr>
+              <w:t>准</w:t>
             </w:r>
             <w:r>
               <w:rPr>
@@ -324,7 +607,7 @@
         <w:tc>
           <w:tcPr>
             <w:tcW w:w="2564" w:type="dxa"/>
-            <w:gridSpan w:val="2"/>
+            <w:gridSpan w:val="3"/>
             <w:tcBorders>
               <w:bottom w:val="single" w:sz="4" w:space="0" w:color="auto"/>
             </w:tcBorders>
@@ -339,14 +622,13 @@
             </w:pPr>
             <w:r>
               <w:rPr>
-                <w:bCs/>
                 <w:noProof/>
               </w:rPr>
               <w:drawing>
-                <wp:inline distT="0" distB="0" distL="114300" distR="114300" wp14:anchorId="0B020A2C" wp14:editId="684CF0C1">
-                  <wp:extent cx="1232535" cy="361950"/>
-                  <wp:effectExtent l="0" t="0" r="0" b="3175"/>
-                  <wp:docPr id="1094318568" name="图片 1" descr="img_20240507162215001"/>
+                <wp:inline distT="0" distB="0" distL="0" distR="0" wp14:anchorId="46B02EC2" wp14:editId="6FFE901B">
+                  <wp:extent cx="1171575" cy="514350"/>
+                  <wp:effectExtent l="0" t="0" r="0" b="0"/>
+                  <wp:docPr id="1283119466" name="图片 1"/>
                   <wp:cNvGraphicFramePr>
                     <a:graphicFrameLocks xmlns:a="http://schemas.openxmlformats.org/drawingml/2006/main" noChangeAspect="1"/>
                   </wp:cNvGraphicFramePr>
@@ -354,13 +636,20 @@
                     <a:graphicData uri="http://schemas.openxmlformats.org/drawingml/2006/picture">
                       <pic:pic xmlns:pic="http://schemas.openxmlformats.org/drawingml/2006/picture">
                         <pic:nvPicPr>
-                          <pic:cNvPr id="2" name="图片 1" descr="img_20240507162215001"/>
+                          <pic:cNvPr id="3" name="图片 1"/>
                           <pic:cNvPicPr>
-                            <a:picLocks noChangeAspect="1"/>
+                            <a:picLocks noChangeAspect="1" noChangeArrowheads="1"/>
                           </pic:cNvPicPr>
                         </pic:nvPicPr>
                         <pic:blipFill>
-                          <a:blip r:embed="rId9"/>
+                          <a:blip r:embed="rId11" cstate="print">
+                            <a:extLst>
+                              <a:ext uri="{28A0092B-C50C-407E-A947-70E740481C1C}">
+                                <a14:useLocalDpi xmlns:a14="http://schemas.microsoft.com/office/drawing/2010/main" val="0"/>
+                              </a:ext>
+                            </a:extLst>
+                          </a:blip>
+                          <a:srcRect t="16455"/>
                           <a:stretch>
                             <a:fillRect/>
                           </a:stretch>
@@ -368,7 +657,7 @@
                         <pic:spPr>
                           <a:xfrm>
                             <a:off x="0" y="0"/>
-                            <a:ext cx="1232535" cy="361950"/>
+                            <a:ext cx="1171575" cy="514350"/>
                           </a:xfrm>
                           <a:prstGeom prst="rect">
                             <a:avLst/>
@@ -389,6 +678,7 @@
         <w:tc>
           <w:tcPr>
             <w:tcW w:w="949" w:type="dxa"/>
+            <w:gridSpan w:val="2"/>
             <w:vAlign w:val="center"/>
           </w:tcPr>
           <w:p>
@@ -441,6 +731,7 @@
         <w:tc>
           <w:tcPr>
             <w:tcW w:w="2510" w:type="dxa"/>
+            <w:gridSpan w:val="3"/>
             <w:tcBorders>
               <w:bottom w:val="single" w:sz="4" w:space="0" w:color="auto"/>
             </w:tcBorders>
@@ -464,7 +755,7 @@
         <w:tc>
           <w:tcPr>
             <w:tcW w:w="1386" w:type="dxa"/>
-            <w:gridSpan w:val="2"/>
+            <w:gridSpan w:val="3"/>
             <w:vAlign w:val="center"/>
           </w:tcPr>
           <w:p>
@@ -500,7 +791,7 @@
                           <pic:cNvPicPr/>
                         </pic:nvPicPr>
                         <pic:blipFill>
-                          <a:blip r:embed="rId10" cstate="print">
+                          <a:blip r:embed="rId12" cstate="print">
                             <a:extLst>
                               <a:ext uri="{28A0092B-C50C-407E-A947-70E740481C1C}">
                                 <a14:useLocalDpi xmlns:a14="http://schemas.microsoft.com/office/drawing/2010/main" val="0"/>
@@ -536,7 +827,7 @@
         <w:tc>
           <w:tcPr>
             <w:tcW w:w="2564" w:type="dxa"/>
-            <w:gridSpan w:val="2"/>
+            <w:gridSpan w:val="3"/>
             <w:tcBorders>
               <w:top w:val="single" w:sz="4" w:space="0" w:color="auto"/>
             </w:tcBorders>
@@ -547,7 +838,7 @@
               <w:jc w:val="center"/>
             </w:pPr>
             <w:r>
-              <w:t>Grace Li</w:t>
+              <w:t>Bruce Jin</w:t>
             </w:r>
           </w:p>
           <w:p>
@@ -562,6 +853,7 @@
         <w:tc>
           <w:tcPr>
             <w:tcW w:w="949" w:type="dxa"/>
+            <w:gridSpan w:val="2"/>
             <w:vAlign w:val="center"/>
           </w:tcPr>
           <w:p>
@@ -590,6 +882,7 @@
         <w:tc>
           <w:tcPr>
             <w:tcW w:w="2510" w:type="dxa"/>
+            <w:gridSpan w:val="3"/>
             <w:tcBorders>
               <w:top w:val="single" w:sz="4" w:space="0" w:color="auto"/>
             </w:tcBorders>
@@ -957,14 +1250,8 @@
         <w:t>Indicates the item(s)/method(s) is (are) not in CMA accreditation scope, the testing data and result is just for scientific research, education, internal quality control and product development etc.</w:t>
       </w:r>
     </w:p>
-    <w:p>
-      <w:pPr>
-        <w:rPr>
-          <w:rFonts w:hint="eastAsia"/>
-        </w:rPr>
-      </w:pPr>
-    </w:p>
     <w:p/>
+    <w:p/>
     <w:p>
       <w:r>
         <w:t>检测报告无批准人签字及</w:t>
@@ -1004,13 +1291,7 @@
         <w:t>An electronic report without the signature of the ' CENTRE TESTING INTERNATIONAL ' digital certificate is considered invalid.</w:t>
       </w:r>
     </w:p>
-    <w:p>
-      <w:pPr>
-        <w:rPr>
-          <w:rFonts w:hint="eastAsia"/>
-        </w:rPr>
-      </w:pPr>
-    </w:p>
+    <w:p/>
     <w:p/>
     <w:p>
       <w:pPr>
@@ -1049,9 +1330,9 @@
       </w:r>
     </w:p>
     <w:sectPr>
-      <w:headerReference w:type="even" r:id="rId11"/>
-      <w:headerReference w:type="default" r:id="rId12"/>
-      <w:headerReference w:type="first" r:id="rId13"/>
+      <w:headerReference w:type="even" r:id="rId13"/>
+      <w:headerReference w:type="default" r:id="rId14"/>
+      <w:headerReference w:type="first" r:id="rId15"/>
       <w:pgSz w:w="11906" w:h="16838"/>
       <w:pgMar w:top="1559" w:right="1559" w:bottom="1559" w:left="1559" w:header="1582" w:footer="992" w:gutter="0"/>
       <w:cols w:space="720"/>
@@ -1110,7 +1391,7 @@
         <w:sz w:val="21"/>
         <w:szCs w:val="21"/>
       </w:rPr>
-      <w:pict w14:anchorId="29B20807">
+      <w:pict w14:anchorId="57537729">
         <v:shapetype id="_x0000_t75" coordsize="21600,21600" o:spt="75" o:preferrelative="t" path="m@4@5l@4@11@9@11@9@5xe" filled="f" stroked="f">
           <v:stroke joinstyle="miter"/>
           <v:formulas>
@@ -1404,7 +1685,7 @@
       <w:rPr>
         <w:b/>
       </w:rPr>
-      <w:pict w14:anchorId="1DB43F18">
+      <w:pict w14:anchorId="6195BBFF">
         <v:shapetype id="_x0000_t75" coordsize="21600,21600" o:spt="75" o:preferrelative="t" path="m@4@5l@4@11@9@11@9@5xe" filled="f" stroked="f">
           <v:stroke joinstyle="miter"/>
           <v:formulas>
@@ -1445,7 +1726,7 @@
         <w:sz w:val="21"/>
         <w:szCs w:val="21"/>
       </w:rPr>
-      <w:pict w14:anchorId="36DDD9AA">
+      <w:pict w14:anchorId="568D1322">
         <v:shapetype id="_x0000_t75" coordsize="21600,21600" o:spt="75" o:preferrelative="t" path="m@4@5l@4@11@9@11@9@5xe" filled="f" stroked="f">
           <v:stroke joinstyle="miter"/>
           <v:formulas>

</xml_diff>

<commit_message>
Allow omitting per-standard result tables and export data tables from disk.
Sample-result tables can be removed per standard while conditions stay; Word export scans 数据表附件 for dropped xlsx files; background network probes no longer trigger Finder SMB mounts.

Co-authored-by: Cursor <cursoragent@cursor.com>
</commit_message>
<xml_diff>
--- a/templates/template_ze.docx
+++ b/templates/template_ze.docx
@@ -225,13 +225,7 @@
         <w:t>Please refer to the following pages</w:t>
       </w:r>
     </w:p>
-    <w:p>
-      <w:pPr>
-        <w:rPr>
-          <w:rFonts w:hint="eastAsia"/>
-        </w:rPr>
-      </w:pPr>
-    </w:p>
+    <w:p/>
     <w:tbl>
       <w:tblPr>
         <w:tblW w:w="8802" w:type="dxa"/>
@@ -580,7 +574,14 @@
                 <w:rFonts w:hint="eastAsia"/>
                 <w:bCs/>
               </w:rPr>
-              <w:t>批。</w:t>
+              <w:t>批</w:t>
+            </w:r>
+            <w:r>
+              <w:rPr>
+                <w:rFonts w:hint="eastAsia"/>
+                <w:bCs/>
+              </w:rPr>
+              <w:t xml:space="preserve">  </w:t>
             </w:r>
             <w:r>
               <w:rPr>
@@ -1391,7 +1392,7 @@
         <w:sz w:val="21"/>
         <w:szCs w:val="21"/>
       </w:rPr>
-      <w:pict w14:anchorId="57537729">
+      <w:pict w14:anchorId="5A3D16D8">
         <v:shapetype id="_x0000_t75" coordsize="21600,21600" o:spt="75" o:preferrelative="t" path="m@4@5l@4@11@9@11@9@5xe" filled="f" stroked="f">
           <v:stroke joinstyle="miter"/>
           <v:formulas>
@@ -1685,7 +1686,7 @@
       <w:rPr>
         <w:b/>
       </w:rPr>
-      <w:pict w14:anchorId="6195BBFF">
+      <w:pict w14:anchorId="10E57A9C">
         <v:shapetype id="_x0000_t75" coordsize="21600,21600" o:spt="75" o:preferrelative="t" path="m@4@5l@4@11@9@11@9@5xe" filled="f" stroked="f">
           <v:stroke joinstyle="miter"/>
           <v:formulas>
@@ -1726,7 +1727,7 @@
         <w:sz w:val="21"/>
         <w:szCs w:val="21"/>
       </w:rPr>
-      <w:pict w14:anchorId="568D1322">
+      <w:pict w14:anchorId="2AD18120">
         <v:shapetype id="_x0000_t75" coordsize="21600,21600" o:spt="75" o:preferrelative="t" path="m@4@5l@4@11@9@11@9@5xe" filled="f" stroked="f">
           <v:stroke joinstyle="miter"/>
           <v:formulas>
@@ -2706,6 +2707,10 @@
 </file>
 
 <file path=customXml/item2.xml><?xml version="1.0" encoding="utf-8"?>
+<b:Sources xmlns:b="http://schemas.openxmlformats.org/officeDocument/2006/bibliography" xmlns="http://schemas.openxmlformats.org/officeDocument/2006/bibliography" SelectedStyle="\APASixthEditionOfficeOnline.xsl" StyleName="APA" Version="6"/>
+</file>
+
+<file path=customXml/item3.xml><?xml version="1.0" encoding="utf-8"?>
 <s:customData xmlns="http://www.wps.cn/officeDocument/2013/wpsCustomData" xmlns:s="http://www.wps.cn/officeDocument/2013/wpsCustomData">
   <customSectProps/>
   <customShpExts>
@@ -2714,10 +2719,6 @@
     <customShpInfo spid="_x0000_s1028"/>
   </customShpExts>
 </s:customData>
-</file>
-
-<file path=customXml/item3.xml><?xml version="1.0" encoding="utf-8"?>
-<b:Sources xmlns:b="http://schemas.openxmlformats.org/officeDocument/2006/bibliography" xmlns="http://schemas.openxmlformats.org/officeDocument/2006/bibliography" SelectedStyle="\APASixthEditionOfficeOnline.xsl" StyleName="APA" Version="6"/>
 </file>
 
 <file path=customXml/itemProps1.xml><?xml version="1.0" encoding="utf-8"?>
@@ -2729,17 +2730,17 @@
 </file>
 
 <file path=customXml/itemProps2.xml><?xml version="1.0" encoding="utf-8"?>
+<ds:datastoreItem xmlns:ds="http://schemas.openxmlformats.org/officeDocument/2006/customXml" ds:itemID="{3A3E1175-E5CB-45A7-8AA5-84715A431438}">
+  <ds:schemaRefs>
+    <ds:schemaRef ds:uri="http://schemas.openxmlformats.org/officeDocument/2006/bibliography"/>
+  </ds:schemaRefs>
+</ds:datastoreItem>
+</file>
+
+<file path=customXml/itemProps3.xml><?xml version="1.0" encoding="utf-8"?>
 <ds:datastoreItem xmlns:ds="http://schemas.openxmlformats.org/officeDocument/2006/customXml" ds:itemID="{B1977F7D-205B-4081-913C-38D41E755F92}">
   <ds:schemaRefs>
     <ds:schemaRef ds:uri="http://www.wps.cn/officeDocument/2013/wpsCustomData"/>
   </ds:schemaRefs>
 </ds:datastoreItem>
-</file>
-
-<file path=customXml/itemProps3.xml><?xml version="1.0" encoding="utf-8"?>
-<ds:datastoreItem xmlns:ds="http://schemas.openxmlformats.org/officeDocument/2006/customXml" ds:itemID="{3A3E1175-E5CB-45A7-8AA5-84715A431438}">
-  <ds:schemaRefs>
-    <ds:schemaRef ds:uri="http://schemas.openxmlformats.org/officeDocument/2006/bibliography"/>
-  </ds:schemaRefs>
-</ds:datastoreItem>
 </file>
</xml_diff>

<commit_message>
Ship Ver 1.3.2: special rules, tester name, and 4-sign templates.
Co-authored-by: Cursor <cursoragent@cursor.com>
</commit_message>
<xml_diff>
--- a/templates/template_ze.docx
+++ b/templates/template_ze.docx
@@ -926,13 +926,13 @@
         <w:t xml:space="preserve">                             </w:t>
       </w:r>
       <w:r>
-        <w:t>上海市闵行区万芳路</w:t>
-      </w:r>
-      <w:r>
-        <w:t>1351</w:t>
-      </w:r>
-      <w:r>
-        <w:t>号</w:t>
+        <w:t>{{实验室地址_cn}}</w:t>
+      </w:r>
+      <w:r>
+        <w:t/>
+      </w:r>
+      <w:r>
+        <w:t/>
       </w:r>
     </w:p>
     <w:p>
@@ -942,7 +942,7 @@
           <w:sz w:val="18"/>
           <w:szCs w:val="18"/>
         </w:rPr>
-        <w:t>Certre Testing International Pinzheng (Shanghai)Co., Ltd.        No.1351, Wanfang Road, Minhang, Shanghai, China</w:t>
+        <w:t>{{实验室地址_en}}</w:t>
       </w:r>
     </w:p>
     <w:p/>

</xml_diff>